<commit_message>
Add dataflow diagram to D2 report; regenerate citation examples from gold set
- D2_Report.docx/.pdf: inserted the required ingest->stores->retrieval->graph dataflow diagram (Figure 1) into Section 2, so the report now satisfies the brief's diagram requirement and matches the README.
- results/d2_architecture.png: the diagram source image.
- results/d2_citation_examples.json: regenerated from the 10 gold-set queries via the live API now that the citation lookup is fixed — real titles/authors/years/rerank scores, consistent with report Section 5 (was empty top_5 before).

Co-Authored-By: Claude Opus 4.8 <noreply@anthropic.com>
</commit_message>
<xml_diff>
--- a/D2_Report.docx
+++ b/D2_Report.docx
@@ -181,13 +181,7 @@
         <w:rPr>
           <w:rFonts w:ascii="Times New Roman" w:hAnsi="Times New Roman" w:cs="Times New Roman"/>
         </w:rPr>
-        <w:t xml:space="preserve"> </w:t>
-      </w:r>
-      <w:r>
-        <w:rPr>
-          <w:rFonts w:ascii="Times New Roman" w:hAnsi="Times New Roman" w:cs="Times New Roman"/>
-        </w:rPr>
-        <w:t>CSAI415_APR26 - Special Topics in AI</w:t>
+        <w:t xml:space="preserve"> CSAI415_APR26 - Special Topics in AI</w:t>
       </w:r>
     </w:p>
     <w:p>
@@ -205,31 +199,7 @@
         <w:rPr>
           <w:rFonts w:ascii="Times New Roman" w:hAnsi="Times New Roman" w:cs="Times New Roman"/>
         </w:rPr>
-        <w:t>‘</w:t>
-      </w:r>
-      <w:r>
-        <w:rPr>
-          <w:rFonts w:ascii="Times New Roman" w:hAnsi="Times New Roman" w:cs="Times New Roman"/>
-        </w:rPr>
-        <w:t>Spring</w:t>
-      </w:r>
-      <w:r>
-        <w:rPr>
-          <w:rFonts w:ascii="Times New Roman" w:hAnsi="Times New Roman" w:cs="Times New Roman"/>
-        </w:rPr>
-        <w:t xml:space="preserve"> 202</w:t>
-      </w:r>
-      <w:r>
-        <w:rPr>
-          <w:rFonts w:ascii="Times New Roman" w:hAnsi="Times New Roman" w:cs="Times New Roman"/>
-        </w:rPr>
-        <w:t>6</w:t>
-      </w:r>
-      <w:r>
-        <w:rPr>
-          <w:rFonts w:ascii="Times New Roman" w:hAnsi="Times New Roman" w:cs="Times New Roman"/>
-        </w:rPr>
-        <w:t>’</w:t>
+        <w:t>‘Spring 2026’</w:t>
       </w:r>
     </w:p>
     <w:p>
@@ -246,19 +216,7 @@
         <w:rPr>
           <w:rFonts w:ascii="Times New Roman" w:hAnsi="Times New Roman" w:cs="Times New Roman"/>
         </w:rPr>
-        <w:t>‘</w:t>
-      </w:r>
-      <w:r>
-        <w:rPr>
-          <w:rFonts w:ascii="Times New Roman" w:hAnsi="Times New Roman" w:cs="Times New Roman"/>
-        </w:rPr>
-        <w:t>Report</w:t>
-      </w:r>
-      <w:r>
-        <w:rPr>
-          <w:rFonts w:ascii="Times New Roman" w:hAnsi="Times New Roman" w:cs="Times New Roman"/>
-        </w:rPr>
-        <w:t>:</w:t>
+        <w:t>‘Report:</w:t>
       </w:r>
       <w:r>
         <w:rPr>
@@ -301,13 +259,7 @@
         <w:rPr>
           <w:rFonts w:ascii="Times New Roman" w:hAnsi="Times New Roman" w:cs="Times New Roman"/>
         </w:rPr>
-        <w:t>Gamze Okmen (22001694)</w:t>
-      </w:r>
-      <w:r>
-        <w:rPr>
-          <w:rFonts w:ascii="Times New Roman" w:hAnsi="Times New Roman" w:cs="Times New Roman"/>
-        </w:rPr>
-        <w:t xml:space="preserve">, </w:t>
+        <w:t xml:space="preserve">Gamze Okmen (22001694), </w:t>
       </w:r>
       <w:r>
         <w:rPr>
@@ -315,63 +267,7 @@
           <w:kern w:val="0"/>
           <w14:ligatures w14:val="none"/>
         </w:rPr>
-        <w:t>Kenan Almukhllati</w:t>
-      </w:r>
-      <w:r>
-        <w:rPr>
-          <w:rFonts w:ascii="Times New Roman" w:eastAsia="Times New Roman" w:hAnsi="Times New Roman" w:cs="Times New Roman"/>
-          <w:kern w:val="0"/>
-          <w14:ligatures w14:val="none"/>
-        </w:rPr>
-        <w:t xml:space="preserve"> (</w:t>
-      </w:r>
-      <w:r>
-        <w:rPr>
-          <w:rFonts w:ascii="Times New Roman" w:eastAsia="Times New Roman" w:hAnsi="Times New Roman" w:cs="Times New Roman"/>
-          <w:kern w:val="0"/>
-          <w14:ligatures w14:val="none"/>
-        </w:rPr>
-        <w:t>2200067</w:t>
-      </w:r>
-      <w:r>
-        <w:rPr>
-          <w:rFonts w:ascii="Times New Roman" w:eastAsia="Times New Roman" w:hAnsi="Times New Roman" w:cs="Times New Roman"/>
-          <w:kern w:val="0"/>
-          <w14:ligatures w14:val="none"/>
-        </w:rPr>
-        <w:t xml:space="preserve">5), </w:t>
-      </w:r>
-      <w:r>
-        <w:rPr>
-          <w:rFonts w:ascii="Times New Roman" w:eastAsia="Times New Roman" w:hAnsi="Times New Roman" w:cs="Times New Roman"/>
-          <w:kern w:val="0"/>
-          <w14:ligatures w14:val="none"/>
-        </w:rPr>
-        <w:t>Alfarouq Alsharif</w:t>
-      </w:r>
-      <w:r>
-        <w:rPr>
-          <w:rFonts w:ascii="Times New Roman" w:eastAsia="Times New Roman" w:hAnsi="Times New Roman" w:cs="Times New Roman"/>
-          <w:kern w:val="0"/>
-          <w14:ligatures w14:val="none"/>
-        </w:rPr>
-        <w:t xml:space="preserve"> (</w:t>
-      </w:r>
-      <w:r>
-        <w:rPr>
-          <w:rFonts w:ascii="Times New Roman" w:eastAsia="Times New Roman" w:hAnsi="Times New Roman" w:cs="Times New Roman"/>
-          <w:kern w:val="0"/>
-          <w14:ligatures w14:val="none"/>
-        </w:rPr>
-        <w:t>22000440</w:t>
-      </w:r>
-      <w:r>
-        <w:rPr>
-          <w:rFonts w:ascii="Times New Roman" w:eastAsia="Times New Roman" w:hAnsi="Times New Roman" w:cs="Times New Roman"/>
-          <w:kern w:val="0"/>
-          <w14:ligatures w14:val="none"/>
-        </w:rPr>
-        <w:t>)</w:t>
+        <w:t>Kenan Almukhllati (22000675), Alfarouq Alsharif (22000440)</w:t>
       </w:r>
     </w:p>
     <w:p>
@@ -388,19 +284,7 @@
         <w:rPr>
           <w:rFonts w:ascii="Times New Roman" w:hAnsi="Times New Roman" w:cs="Times New Roman"/>
         </w:rPr>
-        <w:t>“</w:t>
-      </w:r>
-      <w:r>
-        <w:rPr>
-          <w:rFonts w:ascii="Times New Roman" w:hAnsi="Times New Roman" w:cs="Times New Roman"/>
-        </w:rPr>
-        <w:t>Production RAG Stack, Graph Build &amp; API</w:t>
-      </w:r>
-      <w:r>
-        <w:rPr>
-          <w:rFonts w:ascii="Times New Roman" w:hAnsi="Times New Roman" w:cs="Times New Roman"/>
-        </w:rPr>
-        <w:t>”</w:t>
+        <w:t>“Production RAG Stack, Graph Build &amp; API”</w:t>
       </w:r>
     </w:p>
     <w:p>
@@ -443,19 +327,7 @@
         <w:rPr>
           <w:rFonts w:ascii="Times New Roman" w:hAnsi="Times New Roman" w:cs="Times New Roman"/>
         </w:rPr>
-        <w:t>Artificial Intelligence</w:t>
-      </w:r>
-      <w:r>
-        <w:rPr>
-          <w:rFonts w:ascii="Times New Roman" w:hAnsi="Times New Roman" w:cs="Times New Roman"/>
-        </w:rPr>
-        <w:t xml:space="preserve">, </w:t>
-      </w:r>
-      <w:r>
-        <w:rPr>
-          <w:rFonts w:ascii="Times New Roman" w:hAnsi="Times New Roman" w:cs="Times New Roman"/>
-        </w:rPr>
-        <w:t>The</w:t>
+        <w:t>Artificial Intelligence, The</w:t>
       </w:r>
       <w:r>
         <w:rPr>
@@ -524,19 +396,7 @@
         <w:rPr>
           <w:rFonts w:ascii="Times New Roman" w:hAnsi="Times New Roman" w:cs="Times New Roman"/>
         </w:rPr>
-        <w:t>Jun 3</w:t>
-      </w:r>
-      <w:r>
-        <w:rPr>
-          <w:rFonts w:ascii="Times New Roman" w:hAnsi="Times New Roman" w:cs="Times New Roman"/>
-        </w:rPr>
-        <w:t>, 202</w:t>
-      </w:r>
-      <w:r>
-        <w:rPr>
-          <w:rFonts w:ascii="Times New Roman" w:hAnsi="Times New Roman" w:cs="Times New Roman"/>
-        </w:rPr>
-        <w:t>6</w:t>
+        <w:t>Jun 3, 2026</w:t>
       </w:r>
     </w:p>
     <w:p>
@@ -553,19 +413,7 @@
         <w:rPr>
           <w:rFonts w:ascii="Times New Roman" w:hAnsi="Times New Roman" w:cs="Times New Roman"/>
         </w:rPr>
-        <w:t>‘S</w:t>
-      </w:r>
-      <w:r>
-        <w:rPr>
-          <w:rFonts w:ascii="Times New Roman" w:hAnsi="Times New Roman" w:cs="Times New Roman"/>
-        </w:rPr>
-        <w:t>ubmitted to</w:t>
-      </w:r>
-      <w:r>
-        <w:rPr>
-          <w:rFonts w:ascii="Times New Roman" w:hAnsi="Times New Roman" w:cs="Times New Roman"/>
-        </w:rPr>
-        <w:t>:</w:t>
+        <w:t>‘Submitted to:</w:t>
       </w:r>
       <w:r>
         <w:rPr>
@@ -578,19 +426,7 @@
         <w:rPr>
           <w:rFonts w:ascii="Times New Roman" w:hAnsi="Times New Roman" w:cs="Times New Roman"/>
         </w:rPr>
-        <w:t xml:space="preserve">Prof. </w:t>
-      </w:r>
-      <w:r>
-        <w:rPr>
-          <w:rFonts w:ascii="Times New Roman" w:hAnsi="Times New Roman" w:cs="Times New Roman"/>
-        </w:rPr>
-        <w:t>Ahmed Awad</w:t>
-      </w:r>
-      <w:r>
-        <w:rPr>
-          <w:rFonts w:ascii="Times New Roman" w:hAnsi="Times New Roman" w:cs="Times New Roman"/>
-        </w:rPr>
-        <w:t>’</w:t>
+        <w:t>Prof. Ahmed Awad’</w:t>
       </w:r>
     </w:p>
     <w:p>
@@ -704,46 +540,10 @@
                 <w:webHidden/>
               </w:rPr>
               <w:tab/>
-            </w:r>
-            <w:r>
-              <w:rPr>
-                <w:noProof/>
-                <w:webHidden/>
-              </w:rPr>
               <w:fldChar w:fldCharType="begin"/>
-            </w:r>
-            <w:r>
-              <w:rPr>
-                <w:noProof/>
-                <w:webHidden/>
-              </w:rPr>
               <w:instrText xml:space="preserve"> PAGEREF _Toc231374985 \h </w:instrText>
-            </w:r>
-            <w:r>
-              <w:rPr>
-                <w:noProof/>
-                <w:webHidden/>
-              </w:rPr>
-            </w:r>
-            <w:r>
-              <w:rPr>
-                <w:noProof/>
-                <w:webHidden/>
-              </w:rPr>
               <w:fldChar w:fldCharType="separate"/>
-            </w:r>
-            <w:r>
-              <w:rPr>
-                <w:noProof/>
-                <w:webHidden/>
-              </w:rPr>
               <w:t>3</w:t>
-            </w:r>
-            <w:r>
-              <w:rPr>
-                <w:noProof/>
-                <w:webHidden/>
-              </w:rPr>
               <w:fldChar w:fldCharType="end"/>
             </w:r>
           </w:hyperlink>
@@ -779,46 +579,10 @@
                 <w:webHidden/>
               </w:rPr>
               <w:tab/>
-            </w:r>
-            <w:r>
-              <w:rPr>
-                <w:noProof/>
-                <w:webHidden/>
-              </w:rPr>
               <w:fldChar w:fldCharType="begin"/>
-            </w:r>
-            <w:r>
-              <w:rPr>
-                <w:noProof/>
-                <w:webHidden/>
-              </w:rPr>
               <w:instrText xml:space="preserve"> PAGEREF _Toc231374986 \h </w:instrText>
-            </w:r>
-            <w:r>
-              <w:rPr>
-                <w:noProof/>
-                <w:webHidden/>
-              </w:rPr>
-            </w:r>
-            <w:r>
-              <w:rPr>
-                <w:noProof/>
-                <w:webHidden/>
-              </w:rPr>
               <w:fldChar w:fldCharType="separate"/>
-            </w:r>
-            <w:r>
-              <w:rPr>
-                <w:noProof/>
-                <w:webHidden/>
-              </w:rPr>
               <w:t>3</w:t>
-            </w:r>
-            <w:r>
-              <w:rPr>
-                <w:noProof/>
-                <w:webHidden/>
-              </w:rPr>
               <w:fldChar w:fldCharType="end"/>
             </w:r>
           </w:hyperlink>
@@ -854,46 +618,10 @@
                 <w:webHidden/>
               </w:rPr>
               <w:tab/>
-            </w:r>
-            <w:r>
-              <w:rPr>
-                <w:noProof/>
-                <w:webHidden/>
-              </w:rPr>
               <w:fldChar w:fldCharType="begin"/>
-            </w:r>
-            <w:r>
-              <w:rPr>
-                <w:noProof/>
-                <w:webHidden/>
-              </w:rPr>
               <w:instrText xml:space="preserve"> PAGEREF _Toc231374987 \h </w:instrText>
-            </w:r>
-            <w:r>
-              <w:rPr>
-                <w:noProof/>
-                <w:webHidden/>
-              </w:rPr>
-            </w:r>
-            <w:r>
-              <w:rPr>
-                <w:noProof/>
-                <w:webHidden/>
-              </w:rPr>
               <w:fldChar w:fldCharType="separate"/>
-            </w:r>
-            <w:r>
-              <w:rPr>
-                <w:noProof/>
-                <w:webHidden/>
-              </w:rPr>
               <w:t>4</w:t>
-            </w:r>
-            <w:r>
-              <w:rPr>
-                <w:noProof/>
-                <w:webHidden/>
-              </w:rPr>
               <w:fldChar w:fldCharType="end"/>
             </w:r>
           </w:hyperlink>
@@ -929,46 +657,10 @@
                 <w:webHidden/>
               </w:rPr>
               <w:tab/>
-            </w:r>
-            <w:r>
-              <w:rPr>
-                <w:noProof/>
-                <w:webHidden/>
-              </w:rPr>
               <w:fldChar w:fldCharType="begin"/>
-            </w:r>
-            <w:r>
-              <w:rPr>
-                <w:noProof/>
-                <w:webHidden/>
-              </w:rPr>
               <w:instrText xml:space="preserve"> PAGEREF _Toc231374988 \h </w:instrText>
-            </w:r>
-            <w:r>
-              <w:rPr>
-                <w:noProof/>
-                <w:webHidden/>
-              </w:rPr>
-            </w:r>
-            <w:r>
-              <w:rPr>
-                <w:noProof/>
-                <w:webHidden/>
-              </w:rPr>
               <w:fldChar w:fldCharType="separate"/>
-            </w:r>
-            <w:r>
-              <w:rPr>
-                <w:noProof/>
-                <w:webHidden/>
-              </w:rPr>
               <w:t>4</w:t>
-            </w:r>
-            <w:r>
-              <w:rPr>
-                <w:noProof/>
-                <w:webHidden/>
-              </w:rPr>
               <w:fldChar w:fldCharType="end"/>
             </w:r>
           </w:hyperlink>
@@ -1003,46 +695,10 @@
                 <w:webHidden/>
               </w:rPr>
               <w:tab/>
-            </w:r>
-            <w:r>
-              <w:rPr>
-                <w:noProof/>
-                <w:webHidden/>
-              </w:rPr>
               <w:fldChar w:fldCharType="begin"/>
-            </w:r>
-            <w:r>
-              <w:rPr>
-                <w:noProof/>
-                <w:webHidden/>
-              </w:rPr>
               <w:instrText xml:space="preserve"> PAGEREF _Toc231374989 \h </w:instrText>
-            </w:r>
-            <w:r>
-              <w:rPr>
-                <w:noProof/>
-                <w:webHidden/>
-              </w:rPr>
-            </w:r>
-            <w:r>
-              <w:rPr>
-                <w:noProof/>
-                <w:webHidden/>
-              </w:rPr>
               <w:fldChar w:fldCharType="separate"/>
-            </w:r>
-            <w:r>
-              <w:rPr>
-                <w:noProof/>
-                <w:webHidden/>
-              </w:rPr>
               <w:t>4</w:t>
-            </w:r>
-            <w:r>
-              <w:rPr>
-                <w:noProof/>
-                <w:webHidden/>
-              </w:rPr>
               <w:fldChar w:fldCharType="end"/>
             </w:r>
           </w:hyperlink>
@@ -1077,46 +733,10 @@
                 <w:webHidden/>
               </w:rPr>
               <w:tab/>
-            </w:r>
-            <w:r>
-              <w:rPr>
-                <w:noProof/>
-                <w:webHidden/>
-              </w:rPr>
               <w:fldChar w:fldCharType="begin"/>
-            </w:r>
-            <w:r>
-              <w:rPr>
-                <w:noProof/>
-                <w:webHidden/>
-              </w:rPr>
               <w:instrText xml:space="preserve"> PAGEREF _Toc231374990 \h </w:instrText>
-            </w:r>
-            <w:r>
-              <w:rPr>
-                <w:noProof/>
-                <w:webHidden/>
-              </w:rPr>
-            </w:r>
-            <w:r>
-              <w:rPr>
-                <w:noProof/>
-                <w:webHidden/>
-              </w:rPr>
               <w:fldChar w:fldCharType="separate"/>
-            </w:r>
-            <w:r>
-              <w:rPr>
-                <w:noProof/>
-                <w:webHidden/>
-              </w:rPr>
               <w:t>5</w:t>
-            </w:r>
-            <w:r>
-              <w:rPr>
-                <w:noProof/>
-                <w:webHidden/>
-              </w:rPr>
               <w:fldChar w:fldCharType="end"/>
             </w:r>
           </w:hyperlink>
@@ -1151,46 +771,10 @@
                 <w:webHidden/>
               </w:rPr>
               <w:tab/>
-            </w:r>
-            <w:r>
-              <w:rPr>
-                <w:noProof/>
-                <w:webHidden/>
-              </w:rPr>
               <w:fldChar w:fldCharType="begin"/>
-            </w:r>
-            <w:r>
-              <w:rPr>
-                <w:noProof/>
-                <w:webHidden/>
-              </w:rPr>
               <w:instrText xml:space="preserve"> PAGEREF _Toc231374991 \h </w:instrText>
-            </w:r>
-            <w:r>
-              <w:rPr>
-                <w:noProof/>
-                <w:webHidden/>
-              </w:rPr>
-            </w:r>
-            <w:r>
-              <w:rPr>
-                <w:noProof/>
-                <w:webHidden/>
-              </w:rPr>
               <w:fldChar w:fldCharType="separate"/>
-            </w:r>
-            <w:r>
-              <w:rPr>
-                <w:noProof/>
-                <w:webHidden/>
-              </w:rPr>
               <w:t>6</w:t>
-            </w:r>
-            <w:r>
-              <w:rPr>
-                <w:noProof/>
-                <w:webHidden/>
-              </w:rPr>
               <w:fldChar w:fldCharType="end"/>
             </w:r>
           </w:hyperlink>
@@ -1225,46 +809,10 @@
                 <w:webHidden/>
               </w:rPr>
               <w:tab/>
-            </w:r>
-            <w:r>
-              <w:rPr>
-                <w:noProof/>
-                <w:webHidden/>
-              </w:rPr>
               <w:fldChar w:fldCharType="begin"/>
-            </w:r>
-            <w:r>
-              <w:rPr>
-                <w:noProof/>
-                <w:webHidden/>
-              </w:rPr>
               <w:instrText xml:space="preserve"> PAGEREF _Toc231374992 \h </w:instrText>
-            </w:r>
-            <w:r>
-              <w:rPr>
-                <w:noProof/>
-                <w:webHidden/>
-              </w:rPr>
-            </w:r>
-            <w:r>
-              <w:rPr>
-                <w:noProof/>
-                <w:webHidden/>
-              </w:rPr>
               <w:fldChar w:fldCharType="separate"/>
-            </w:r>
-            <w:r>
-              <w:rPr>
-                <w:noProof/>
-                <w:webHidden/>
-              </w:rPr>
               <w:t>6</w:t>
-            </w:r>
-            <w:r>
-              <w:rPr>
-                <w:noProof/>
-                <w:webHidden/>
-              </w:rPr>
               <w:fldChar w:fldCharType="end"/>
             </w:r>
           </w:hyperlink>
@@ -1300,46 +848,10 @@
                 <w:webHidden/>
               </w:rPr>
               <w:tab/>
-            </w:r>
-            <w:r>
-              <w:rPr>
-                <w:noProof/>
-                <w:webHidden/>
-              </w:rPr>
               <w:fldChar w:fldCharType="begin"/>
-            </w:r>
-            <w:r>
-              <w:rPr>
-                <w:noProof/>
-                <w:webHidden/>
-              </w:rPr>
               <w:instrText xml:space="preserve"> PAGEREF _Toc231374993 \h </w:instrText>
-            </w:r>
-            <w:r>
-              <w:rPr>
-                <w:noProof/>
-                <w:webHidden/>
-              </w:rPr>
-            </w:r>
-            <w:r>
-              <w:rPr>
-                <w:noProof/>
-                <w:webHidden/>
-              </w:rPr>
               <w:fldChar w:fldCharType="separate"/>
-            </w:r>
-            <w:r>
-              <w:rPr>
-                <w:noProof/>
-                <w:webHidden/>
-              </w:rPr>
               <w:t>7</w:t>
-            </w:r>
-            <w:r>
-              <w:rPr>
-                <w:noProof/>
-                <w:webHidden/>
-              </w:rPr>
               <w:fldChar w:fldCharType="end"/>
             </w:r>
           </w:hyperlink>
@@ -1375,46 +887,10 @@
                 <w:webHidden/>
               </w:rPr>
               <w:tab/>
-            </w:r>
-            <w:r>
-              <w:rPr>
-                <w:noProof/>
-                <w:webHidden/>
-              </w:rPr>
               <w:fldChar w:fldCharType="begin"/>
-            </w:r>
-            <w:r>
-              <w:rPr>
-                <w:noProof/>
-                <w:webHidden/>
-              </w:rPr>
               <w:instrText xml:space="preserve"> PAGEREF _Toc231374994 \h </w:instrText>
-            </w:r>
-            <w:r>
-              <w:rPr>
-                <w:noProof/>
-                <w:webHidden/>
-              </w:rPr>
-            </w:r>
-            <w:r>
-              <w:rPr>
-                <w:noProof/>
-                <w:webHidden/>
-              </w:rPr>
               <w:fldChar w:fldCharType="separate"/>
-            </w:r>
-            <w:r>
-              <w:rPr>
-                <w:noProof/>
-                <w:webHidden/>
-              </w:rPr>
               <w:t>7</w:t>
-            </w:r>
-            <w:r>
-              <w:rPr>
-                <w:noProof/>
-                <w:webHidden/>
-              </w:rPr>
               <w:fldChar w:fldCharType="end"/>
             </w:r>
           </w:hyperlink>
@@ -1449,46 +925,10 @@
                 <w:webHidden/>
               </w:rPr>
               <w:tab/>
-            </w:r>
-            <w:r>
-              <w:rPr>
-                <w:noProof/>
-                <w:webHidden/>
-              </w:rPr>
               <w:fldChar w:fldCharType="begin"/>
-            </w:r>
-            <w:r>
-              <w:rPr>
-                <w:noProof/>
-                <w:webHidden/>
-              </w:rPr>
               <w:instrText xml:space="preserve"> PAGEREF _Toc231374995 \h </w:instrText>
-            </w:r>
-            <w:r>
-              <w:rPr>
-                <w:noProof/>
-                <w:webHidden/>
-              </w:rPr>
-            </w:r>
-            <w:r>
-              <w:rPr>
-                <w:noProof/>
-                <w:webHidden/>
-              </w:rPr>
               <w:fldChar w:fldCharType="separate"/>
-            </w:r>
-            <w:r>
-              <w:rPr>
-                <w:noProof/>
-                <w:webHidden/>
-              </w:rPr>
               <w:t>8</w:t>
-            </w:r>
-            <w:r>
-              <w:rPr>
-                <w:noProof/>
-                <w:webHidden/>
-              </w:rPr>
               <w:fldChar w:fldCharType="end"/>
             </w:r>
           </w:hyperlink>
@@ -1523,46 +963,10 @@
                 <w:webHidden/>
               </w:rPr>
               <w:tab/>
-            </w:r>
-            <w:r>
-              <w:rPr>
-                <w:noProof/>
-                <w:webHidden/>
-              </w:rPr>
               <w:fldChar w:fldCharType="begin"/>
-            </w:r>
-            <w:r>
-              <w:rPr>
-                <w:noProof/>
-                <w:webHidden/>
-              </w:rPr>
               <w:instrText xml:space="preserve"> PAGEREF _Toc231374996 \h </w:instrText>
-            </w:r>
-            <w:r>
-              <w:rPr>
-                <w:noProof/>
-                <w:webHidden/>
-              </w:rPr>
-            </w:r>
-            <w:r>
-              <w:rPr>
-                <w:noProof/>
-                <w:webHidden/>
-              </w:rPr>
               <w:fldChar w:fldCharType="separate"/>
-            </w:r>
-            <w:r>
-              <w:rPr>
-                <w:noProof/>
-                <w:webHidden/>
-              </w:rPr>
               <w:t>8</w:t>
-            </w:r>
-            <w:r>
-              <w:rPr>
-                <w:noProof/>
-                <w:webHidden/>
-              </w:rPr>
               <w:fldChar w:fldCharType="end"/>
             </w:r>
           </w:hyperlink>
@@ -1597,46 +1001,10 @@
                 <w:webHidden/>
               </w:rPr>
               <w:tab/>
-            </w:r>
-            <w:r>
-              <w:rPr>
-                <w:noProof/>
-                <w:webHidden/>
-              </w:rPr>
               <w:fldChar w:fldCharType="begin"/>
-            </w:r>
-            <w:r>
-              <w:rPr>
-                <w:noProof/>
-                <w:webHidden/>
-              </w:rPr>
               <w:instrText xml:space="preserve"> PAGEREF _Toc231374997 \h </w:instrText>
-            </w:r>
-            <w:r>
-              <w:rPr>
-                <w:noProof/>
-                <w:webHidden/>
-              </w:rPr>
-            </w:r>
-            <w:r>
-              <w:rPr>
-                <w:noProof/>
-                <w:webHidden/>
-              </w:rPr>
               <w:fldChar w:fldCharType="separate"/>
-            </w:r>
-            <w:r>
-              <w:rPr>
-                <w:noProof/>
-                <w:webHidden/>
-              </w:rPr>
               <w:t>9</w:t>
-            </w:r>
-            <w:r>
-              <w:rPr>
-                <w:noProof/>
-                <w:webHidden/>
-              </w:rPr>
               <w:fldChar w:fldCharType="end"/>
             </w:r>
           </w:hyperlink>
@@ -1672,46 +1040,10 @@
                 <w:webHidden/>
               </w:rPr>
               <w:tab/>
-            </w:r>
-            <w:r>
-              <w:rPr>
-                <w:noProof/>
-                <w:webHidden/>
-              </w:rPr>
               <w:fldChar w:fldCharType="begin"/>
-            </w:r>
-            <w:r>
-              <w:rPr>
-                <w:noProof/>
-                <w:webHidden/>
-              </w:rPr>
               <w:instrText xml:space="preserve"> PAGEREF _Toc231374998 \h </w:instrText>
-            </w:r>
-            <w:r>
-              <w:rPr>
-                <w:noProof/>
-                <w:webHidden/>
-              </w:rPr>
-            </w:r>
-            <w:r>
-              <w:rPr>
-                <w:noProof/>
-                <w:webHidden/>
-              </w:rPr>
               <w:fldChar w:fldCharType="separate"/>
-            </w:r>
-            <w:r>
-              <w:rPr>
-                <w:noProof/>
-                <w:webHidden/>
-              </w:rPr>
               <w:t>10</w:t>
-            </w:r>
-            <w:r>
-              <w:rPr>
-                <w:noProof/>
-                <w:webHidden/>
-              </w:rPr>
               <w:fldChar w:fldCharType="end"/>
             </w:r>
           </w:hyperlink>
@@ -1747,46 +1079,10 @@
                 <w:webHidden/>
               </w:rPr>
               <w:tab/>
-            </w:r>
-            <w:r>
-              <w:rPr>
-                <w:noProof/>
-                <w:webHidden/>
-              </w:rPr>
               <w:fldChar w:fldCharType="begin"/>
-            </w:r>
-            <w:r>
-              <w:rPr>
-                <w:noProof/>
-                <w:webHidden/>
-              </w:rPr>
               <w:instrText xml:space="preserve"> PAGEREF _Toc231374999 \h </w:instrText>
-            </w:r>
-            <w:r>
-              <w:rPr>
-                <w:noProof/>
-                <w:webHidden/>
-              </w:rPr>
-            </w:r>
-            <w:r>
-              <w:rPr>
-                <w:noProof/>
-                <w:webHidden/>
-              </w:rPr>
               <w:fldChar w:fldCharType="separate"/>
-            </w:r>
-            <w:r>
-              <w:rPr>
-                <w:noProof/>
-                <w:webHidden/>
-              </w:rPr>
               <w:t>10</w:t>
-            </w:r>
-            <w:r>
-              <w:rPr>
-                <w:noProof/>
-                <w:webHidden/>
-              </w:rPr>
               <w:fldChar w:fldCharType="end"/>
             </w:r>
           </w:hyperlink>
@@ -1821,46 +1117,10 @@
                 <w:webHidden/>
               </w:rPr>
               <w:tab/>
-            </w:r>
-            <w:r>
-              <w:rPr>
-                <w:noProof/>
-                <w:webHidden/>
-              </w:rPr>
               <w:fldChar w:fldCharType="begin"/>
-            </w:r>
-            <w:r>
-              <w:rPr>
-                <w:noProof/>
-                <w:webHidden/>
-              </w:rPr>
               <w:instrText xml:space="preserve"> PAGEREF _Toc231375000 \h </w:instrText>
-            </w:r>
-            <w:r>
-              <w:rPr>
-                <w:noProof/>
-                <w:webHidden/>
-              </w:rPr>
-            </w:r>
-            <w:r>
-              <w:rPr>
-                <w:noProof/>
-                <w:webHidden/>
-              </w:rPr>
               <w:fldChar w:fldCharType="separate"/>
-            </w:r>
-            <w:r>
-              <w:rPr>
-                <w:noProof/>
-                <w:webHidden/>
-              </w:rPr>
               <w:t>10</w:t>
-            </w:r>
-            <w:r>
-              <w:rPr>
-                <w:noProof/>
-                <w:webHidden/>
-              </w:rPr>
               <w:fldChar w:fldCharType="end"/>
             </w:r>
           </w:hyperlink>
@@ -1895,46 +1155,10 @@
                 <w:webHidden/>
               </w:rPr>
               <w:tab/>
-            </w:r>
-            <w:r>
-              <w:rPr>
-                <w:noProof/>
-                <w:webHidden/>
-              </w:rPr>
               <w:fldChar w:fldCharType="begin"/>
-            </w:r>
-            <w:r>
-              <w:rPr>
-                <w:noProof/>
-                <w:webHidden/>
-              </w:rPr>
               <w:instrText xml:space="preserve"> PAGEREF _Toc231375001 \h </w:instrText>
-            </w:r>
-            <w:r>
-              <w:rPr>
-                <w:noProof/>
-                <w:webHidden/>
-              </w:rPr>
-            </w:r>
-            <w:r>
-              <w:rPr>
-                <w:noProof/>
-                <w:webHidden/>
-              </w:rPr>
               <w:fldChar w:fldCharType="separate"/>
-            </w:r>
-            <w:r>
-              <w:rPr>
-                <w:noProof/>
-                <w:webHidden/>
-              </w:rPr>
               <w:t>11</w:t>
-            </w:r>
-            <w:r>
-              <w:rPr>
-                <w:noProof/>
-                <w:webHidden/>
-              </w:rPr>
               <w:fldChar w:fldCharType="end"/>
             </w:r>
           </w:hyperlink>
@@ -1969,46 +1193,10 @@
                 <w:webHidden/>
               </w:rPr>
               <w:tab/>
-            </w:r>
-            <w:r>
-              <w:rPr>
-                <w:noProof/>
-                <w:webHidden/>
-              </w:rPr>
               <w:fldChar w:fldCharType="begin"/>
-            </w:r>
-            <w:r>
-              <w:rPr>
-                <w:noProof/>
-                <w:webHidden/>
-              </w:rPr>
               <w:instrText xml:space="preserve"> PAGEREF _Toc231375002 \h </w:instrText>
-            </w:r>
-            <w:r>
-              <w:rPr>
-                <w:noProof/>
-                <w:webHidden/>
-              </w:rPr>
-            </w:r>
-            <w:r>
-              <w:rPr>
-                <w:noProof/>
-                <w:webHidden/>
-              </w:rPr>
               <w:fldChar w:fldCharType="separate"/>
-            </w:r>
-            <w:r>
-              <w:rPr>
-                <w:noProof/>
-                <w:webHidden/>
-              </w:rPr>
               <w:t>11</w:t>
-            </w:r>
-            <w:r>
-              <w:rPr>
-                <w:noProof/>
-                <w:webHidden/>
-              </w:rPr>
               <w:fldChar w:fldCharType="end"/>
             </w:r>
           </w:hyperlink>
@@ -2043,46 +1231,10 @@
                 <w:webHidden/>
               </w:rPr>
               <w:tab/>
-            </w:r>
-            <w:r>
-              <w:rPr>
-                <w:noProof/>
-                <w:webHidden/>
-              </w:rPr>
               <w:fldChar w:fldCharType="begin"/>
-            </w:r>
-            <w:r>
-              <w:rPr>
-                <w:noProof/>
-                <w:webHidden/>
-              </w:rPr>
               <w:instrText xml:space="preserve"> PAGEREF _Toc231375003 \h </w:instrText>
-            </w:r>
-            <w:r>
-              <w:rPr>
-                <w:noProof/>
-                <w:webHidden/>
-              </w:rPr>
-            </w:r>
-            <w:r>
-              <w:rPr>
-                <w:noProof/>
-                <w:webHidden/>
-              </w:rPr>
               <w:fldChar w:fldCharType="separate"/>
-            </w:r>
-            <w:r>
-              <w:rPr>
-                <w:noProof/>
-                <w:webHidden/>
-              </w:rPr>
               <w:t>11</w:t>
-            </w:r>
-            <w:r>
-              <w:rPr>
-                <w:noProof/>
-                <w:webHidden/>
-              </w:rPr>
               <w:fldChar w:fldCharType="end"/>
             </w:r>
           </w:hyperlink>
@@ -2118,46 +1270,10 @@
                 <w:webHidden/>
               </w:rPr>
               <w:tab/>
-            </w:r>
-            <w:r>
-              <w:rPr>
-                <w:noProof/>
-                <w:webHidden/>
-              </w:rPr>
               <w:fldChar w:fldCharType="begin"/>
-            </w:r>
-            <w:r>
-              <w:rPr>
-                <w:noProof/>
-                <w:webHidden/>
-              </w:rPr>
               <w:instrText xml:space="preserve"> PAGEREF _Toc231375004 \h </w:instrText>
-            </w:r>
-            <w:r>
-              <w:rPr>
-                <w:noProof/>
-                <w:webHidden/>
-              </w:rPr>
-            </w:r>
-            <w:r>
-              <w:rPr>
-                <w:noProof/>
-                <w:webHidden/>
-              </w:rPr>
               <w:fldChar w:fldCharType="separate"/>
-            </w:r>
-            <w:r>
-              <w:rPr>
-                <w:noProof/>
-                <w:webHidden/>
-              </w:rPr>
               <w:t>11</w:t>
-            </w:r>
-            <w:r>
-              <w:rPr>
-                <w:noProof/>
-                <w:webHidden/>
-              </w:rPr>
               <w:fldChar w:fldCharType="end"/>
             </w:r>
           </w:hyperlink>
@@ -2193,46 +1309,10 @@
                 <w:webHidden/>
               </w:rPr>
               <w:tab/>
-            </w:r>
-            <w:r>
-              <w:rPr>
-                <w:noProof/>
-                <w:webHidden/>
-              </w:rPr>
               <w:fldChar w:fldCharType="begin"/>
-            </w:r>
-            <w:r>
-              <w:rPr>
-                <w:noProof/>
-                <w:webHidden/>
-              </w:rPr>
               <w:instrText xml:space="preserve"> PAGEREF _Toc231375005 \h </w:instrText>
-            </w:r>
-            <w:r>
-              <w:rPr>
-                <w:noProof/>
-                <w:webHidden/>
-              </w:rPr>
-            </w:r>
-            <w:r>
-              <w:rPr>
-                <w:noProof/>
-                <w:webHidden/>
-              </w:rPr>
               <w:fldChar w:fldCharType="separate"/>
-            </w:r>
-            <w:r>
-              <w:rPr>
-                <w:noProof/>
-                <w:webHidden/>
-              </w:rPr>
               <w:t>11</w:t>
-            </w:r>
-            <w:r>
-              <w:rPr>
-                <w:noProof/>
-                <w:webHidden/>
-              </w:rPr>
               <w:fldChar w:fldCharType="end"/>
             </w:r>
           </w:hyperlink>
@@ -2343,6 +1423,64 @@
           <w:szCs w:val="20"/>
         </w:rPr>
         <w:t>The stack is a ground-up replacement of D1's in-memory mocks with real, persistent services. MongoDB and Qdrant run as Docker containers with named volumes and health checks. Neo4j is hosted on Aura. FastAPI exposes the corpus, retrieval pipeline, and graph through typed HTTP endpoints. Every I/O path is async.</w:t>
+      </w:r>
+    </w:p>
+    <w:p>
+      <w:pPr>
+        <w:spacing w:before="120" w:after="40"/>
+        <w:jc w:val="center"/>
+      </w:pPr>
+      <w:r>
+        <w:drawing>
+          <wp:inline distT="0" distB="0" distL="0" distR="0">
+            <wp:extent cx="5029200" cy="2730754"/>
+            <wp:effectExtent l="0" t="0" r="0" b="0"/>
+            <wp:docPr id="100" name="Figure 1 Dataflow"/>
+            <wp:cNvGraphicFramePr>
+              <a:graphicFrameLocks xmlns:a="http://schemas.openxmlformats.org/drawingml/2006/main" noChangeAspect="1"/>
+            </wp:cNvGraphicFramePr>
+            <a:graphic xmlns:a="http://schemas.openxmlformats.org/drawingml/2006/main">
+              <a:graphicData uri="http://schemas.openxmlformats.org/drawingml/2006/picture">
+                <pic:pic xmlns:pic="http://schemas.openxmlformats.org/drawingml/2006/picture">
+                  <pic:nvPicPr>
+                    <pic:cNvPr id="100" name="d2_architecture.png"/>
+                    <pic:cNvPicPr/>
+                  </pic:nvPicPr>
+                  <pic:blipFill>
+                    <a:blip xmlns:r="http://schemas.openxmlformats.org/officeDocument/2006/relationships" r:embed="rId200"/>
+                    <a:stretch>
+                      <a:fillRect/>
+                    </a:stretch>
+                  </pic:blipFill>
+                  <pic:spPr>
+                    <a:xfrm>
+                      <a:off x="0" y="0"/>
+                      <a:ext cx="5029200" cy="2730754"/>
+                    </a:xfrm>
+                    <a:prstGeom prst="rect">
+                      <a:avLst/>
+                    </a:prstGeom>
+                  </pic:spPr>
+                </pic:pic>
+              </a:graphicData>
+            </a:graphic>
+          </wp:inline>
+        </w:drawing>
+      </w:r>
+    </w:p>
+    <w:p>
+      <w:pPr>
+        <w:spacing w:after="160"/>
+        <w:jc w:val="center"/>
+      </w:pPr>
+      <w:r>
+        <w:rPr>
+          <w:rFonts w:ascii="Calibri" w:eastAsia="Calibri" w:hAnsi="Calibri" w:cs="Calibri"/>
+          <w:i/>
+          <w:sz w:val="18"/>
+          <w:szCs w:val="18"/>
+        </w:rPr>
+        <w:t>Figure 1. System dataflow: ingest → stores (MongoDB / Qdrant / Neo4j) → hybrid retrieval → graph.</w:t>
       </w:r>
     </w:p>
     <w:p>
@@ -5418,13 +4556,6 @@
           <w:szCs w:val="20"/>
         </w:rPr>
         <w:t xml:space="preserve">Per-query Recall@5 was measured for all four modes across the 30-query gold set. 22 of 30 queries were answered correctly by all four modes simultaneously — these are the easy cases where the relevant paper is unambiguously </w:t>
-      </w:r>
-      <w:r>
-        <w:rPr>
-          <w:rFonts w:ascii="Calibri" w:eastAsia="Calibri" w:hAnsi="Calibri" w:cs="Calibri"/>
-          <w:sz w:val="20"/>
-          <w:szCs w:val="20"/>
-        </w:rPr>
         <w:lastRenderedPageBreak/>
         <w:t>the most similar document in the corpus. 3 of 30 queries were missed by dense-only retrieval but recovered by the reranker — these are cases where embedding similarity is misleading (e.g. a query about wireless communications that superficially resembles RAG content) but cross-encoder scoring correctly identifies the source paper. Full per-query results are in results/d2_per_query_metrics.json.</w:t>
       </w:r>

</xml_diff>